<commit_message>
:books: Finalizando correção na documentação da Task
</commit_message>
<xml_diff>
--- a/Documents/Documents/Sprint07_Task084_Implementar_Validacoes_para_a_Classe_Unit_of_Measure.docx
+++ b/Documents/Documents/Sprint07_Task084_Implementar_Validacoes_para_a_Classe_Unit_of_Measure.docx
@@ -178,6 +178,12 @@
                 <w:bCs/>
               </w:rPr>
               <w:t xml:space="preserve"> </w:t>
+            </w:r>
+            <w:r>
+              <w:rPr>
+                <w:b/>
+              </w:rPr>
+              <w:t>14/10/2025</w:t>
             </w:r>
           </w:p>
         </w:tc>
@@ -341,7 +347,11 @@
             <w:tcW w:w="10201" w:type="dxa"/>
             <w:gridSpan w:val="3"/>
           </w:tcPr>
-          <w:p/>
+          <w:p>
+            <w:r>
+              <w:t>Marco Antônio Dos Santos Masson</w:t>
+            </w:r>
+          </w:p>
         </w:tc>
       </w:tr>
       <w:tr>
@@ -350,7 +360,11 @@
             <w:tcW w:w="10201" w:type="dxa"/>
             <w:gridSpan w:val="3"/>
           </w:tcPr>
-          <w:p/>
+          <w:p>
+            <w:r>
+              <w:t>Rodrigo Yoshida Lombezi</w:t>
+            </w:r>
+          </w:p>
         </w:tc>
       </w:tr>
       <w:tr>
@@ -359,7 +373,11 @@
             <w:tcW w:w="10201" w:type="dxa"/>
             <w:gridSpan w:val="3"/>
           </w:tcPr>
-          <w:p/>
+          <w:p>
+            <w:r>
+              <w:t xml:space="preserve">Franciane Ramos Franco </w:t>
+            </w:r>
+          </w:p>
         </w:tc>
       </w:tr>
       <w:tr>
@@ -368,11 +386,18 @@
             <w:tcW w:w="10201" w:type="dxa"/>
             <w:gridSpan w:val="3"/>
           </w:tcPr>
-          <w:p/>
+          <w:p>
+            <w:r>
+              <w:t>Vinicius Lúcio Marcolino da Silva</w:t>
+            </w:r>
+          </w:p>
         </w:tc>
       </w:tr>
     </w:tbl>
-    <w:p/>
+    <w:p>
+      <w:bookmarkStart w:id="0" w:name="_GoBack"/>
+      <w:bookmarkEnd w:id="0"/>
+    </w:p>
     <w:tbl>
       <w:tblPr>
         <w:tblStyle w:val="Tabelacomgrade"/>
@@ -469,6 +494,9 @@
           </w:tcPr>
           <w:p>
             <w:r>
+              <w:t xml:space="preserve">Sprint </w:t>
+            </w:r>
+            <w:r>
               <w:t>Implementar validações para a classe unit of measure</w:t>
             </w:r>
           </w:p>
@@ -480,13 +508,11 @@
           <w:p>
             <w:pPr>
               <w:rPr>
-                <w:b/>
                 <w:bCs/>
               </w:rPr>
             </w:pPr>
             <w:r>
               <w:rPr>
-                <w:b/>
                 <w:bCs/>
               </w:rPr>
               <w:t>10/10/2025</w:t>
@@ -1797,8 +1823,6 @@
         </w:rPr>
         <w:t>Esses validadores garantem que os dados sejam limpos e padronizados antes de chegar à camada de serviço.</w:t>
       </w:r>
-      <w:bookmarkStart w:id="0" w:name="_GoBack"/>
-      <w:bookmarkEnd w:id="0"/>
     </w:p>
     <w:p>
       <w:pPr>
@@ -6876,6 +6900,21 @@
 </file>
 
 <file path=customXml/item1.xml><?xml version="1.0" encoding="utf-8"?>
+<p:properties xmlns:p="http://schemas.microsoft.com/office/2006/metadata/properties" xmlns:xsi="http://www.w3.org/2001/XMLSchema-instance" xmlns:pc="http://schemas.microsoft.com/office/infopath/2007/PartnerControls">
+  <documentManagement/>
+</p:properties>
+</file>
+
+<file path=customXml/item2.xml><?xml version="1.0" encoding="utf-8"?>
+<?mso-contentType ?>
+<FormTemplates xmlns="http://schemas.microsoft.com/sharepoint/v3/contenttype/forms">
+  <Display>DocumentLibraryForm</Display>
+  <Edit>DocumentLibraryForm</Edit>
+  <New>DocumentLibraryForm</New>
+</FormTemplates>
+</file>
+
+<file path=customXml/item3.xml><?xml version="1.0" encoding="utf-8"?>
 <ct:contentTypeSchema xmlns:ct="http://schemas.microsoft.com/office/2006/metadata/contentType" xmlns:ma="http://schemas.microsoft.com/office/2006/metadata/properties/metaAttributes" ct:_="" ma:_="" ma:contentTypeName="Documento" ma:contentTypeID="0x010100B37008164333CE47B7554A23BF4CE40A" ma:contentTypeVersion="3" ma:contentTypeDescription="Crie um novo documento." ma:contentTypeScope="" ma:versionID="01d70e1db2e5282cbeb036b3d8462683">
   <xsd:schema xmlns:xsd="http://www.w3.org/2001/XMLSchema" xmlns:xs="http://www.w3.org/2001/XMLSchema" xmlns:p="http://schemas.microsoft.com/office/2006/metadata/properties" xmlns:ns2="0dd540f2-19ea-4199-a9ce-e531162f98d7" targetNamespace="http://schemas.microsoft.com/office/2006/metadata/properties" ma:root="true" ma:fieldsID="b0ca1735cf6dfdacfbf35c674503d2b1" ns2:_="">
     <xsd:import namespace="0dd540f2-19ea-4199-a9ce-e531162f98d7"/>
@@ -7013,22 +7052,24 @@
 </ct:contentTypeSchema>
 </file>
 
-<file path=customXml/item2.xml><?xml version="1.0" encoding="utf-8"?>
-<?mso-contentType ?>
-<FormTemplates xmlns="http://schemas.microsoft.com/sharepoint/v3/contenttype/forms">
-  <Display>DocumentLibraryForm</Display>
-  <Edit>DocumentLibraryForm</Edit>
-  <New>DocumentLibraryForm</New>
-</FormTemplates>
+<file path=customXml/itemProps1.xml><?xml version="1.0" encoding="utf-8"?>
+<ds:datastoreItem xmlns:ds="http://schemas.openxmlformats.org/officeDocument/2006/customXml" ds:itemID="{0028EFB7-3706-477C-BC22-76AF0C752638}">
+  <ds:schemaRefs>
+    <ds:schemaRef ds:uri="http://schemas.microsoft.com/office/2006/metadata/properties"/>
+    <ds:schemaRef ds:uri="http://schemas.microsoft.com/office/infopath/2007/PartnerControls"/>
+  </ds:schemaRefs>
+</ds:datastoreItem>
 </file>
 
-<file path=customXml/item3.xml><?xml version="1.0" encoding="utf-8"?>
-<p:properties xmlns:p="http://schemas.microsoft.com/office/2006/metadata/properties" xmlns:xsi="http://www.w3.org/2001/XMLSchema-instance" xmlns:pc="http://schemas.microsoft.com/office/infopath/2007/PartnerControls">
-  <documentManagement/>
-</p:properties>
+<file path=customXml/itemProps2.xml><?xml version="1.0" encoding="utf-8"?>
+<ds:datastoreItem xmlns:ds="http://schemas.openxmlformats.org/officeDocument/2006/customXml" ds:itemID="{0876BD9A-9CA5-48C2-BF8E-F2DECFB0FD38}">
+  <ds:schemaRefs>
+    <ds:schemaRef ds:uri="http://schemas.microsoft.com/sharepoint/v3/contenttype/forms"/>
+  </ds:schemaRefs>
+</ds:datastoreItem>
 </file>
 
-<file path=customXml/itemProps1.xml><?xml version="1.0" encoding="utf-8"?>
+<file path=customXml/itemProps3.xml><?xml version="1.0" encoding="utf-8"?>
 <ds:datastoreItem xmlns:ds="http://schemas.openxmlformats.org/officeDocument/2006/customXml" ds:itemID="{3258D31E-C4C0-4BAE-8DEF-91B5992C0A3A}">
   <ds:schemaRefs>
     <ds:schemaRef ds:uri="http://schemas.microsoft.com/office/2006/metadata/contentType"/>
@@ -7044,21 +7085,4 @@
     <ds:schemaRef ds:uri="http://schemas.microsoft.com/internal/obd"/>
   </ds:schemaRefs>
 </ds:datastoreItem>
-</file>
-
-<file path=customXml/itemProps2.xml><?xml version="1.0" encoding="utf-8"?>
-<ds:datastoreItem xmlns:ds="http://schemas.openxmlformats.org/officeDocument/2006/customXml" ds:itemID="{0876BD9A-9CA5-48C2-BF8E-F2DECFB0FD38}">
-  <ds:schemaRefs>
-    <ds:schemaRef ds:uri="http://schemas.microsoft.com/sharepoint/v3/contenttype/forms"/>
-  </ds:schemaRefs>
-</ds:datastoreItem>
-</file>
-
-<file path=customXml/itemProps3.xml><?xml version="1.0" encoding="utf-8"?>
-<ds:datastoreItem xmlns:ds="http://schemas.openxmlformats.org/officeDocument/2006/customXml" ds:itemID="{0028EFB7-3706-477C-BC22-76AF0C752638}">
-  <ds:schemaRefs>
-    <ds:schemaRef ds:uri="http://schemas.microsoft.com/office/2006/metadata/properties"/>
-    <ds:schemaRef ds:uri="http://schemas.microsoft.com/office/infopath/2007/PartnerControls"/>
-  </ds:schemaRefs>
-</ds:datastoreItem>
 </file>
</xml_diff>